<commit_message>
Simplify: drop VNet integration and service-endpoint details
The workload is all-in-Azure with no private-ingress requirement, so VNet integration is not a justification for Premium and the service-endpoints vs private-endpoints detail was noise. Premium is now recommended purely for multi-region DR (regional-outage survival), one auto-replicated config, and the 99.99% SLA. Removed the networking framing from README, docs/architecture.md, the report, and both diagrams; the control-plane (createRun via ARM, RBAC-authorized) point is retained. Report and Premium diagram regenerated.

Co-authored-by: Copilot <223556219+Copilot@users.noreply.github.com>
</commit_message>
<xml_diff>
--- a/docs/ADF-CrossRegion-DR-Recommendation.docx
+++ b/docs/ADF-CrossRegion-DR-Recommendation.docx
@@ -76,7 +76,7 @@
         <w:t xml:space="preserve">Azure API Management (APIM) Premium multi-region</w:t>
       </w:r>
       <w:r>
-        <w:t xml:space="preserve"> service. It exposes one stable endpoint, decides which regional factory to trigger, and — critically — survives the loss of an entire region while running inside your VNet. Autosys changes nothing on failover.</w:t>
+        <w:t xml:space="preserve"> service. It exposes one stable endpoint, decides which regional factory to trigger, and — critically — survives the loss of an entire region. Autosys changes nothing on failover.</w:t>
       </w:r>
     </w:p>
     <w:p>
@@ -153,10 +153,10 @@
           <w:b/>
           <w:bCs/>
         </w:rPr>
-        <w:t xml:space="preserve">Runs inside your VNet. </w:t>
-      </w:r>
-      <w:r>
-        <w:t xml:space="preserve">Premium supports VNet integration, keeping traffic on the Azure backbone. Because your workload is entirely in Azure, service endpoints secure the ADF backends at no extra cost; private endpoints are available if you need per-resource isolation.</w:t>
+        <w:t xml:space="preserve">Enterprise SLA. </w:t>
+      </w:r>
+      <w:r>
+        <w:t xml:space="preserve">A 99.99% platform SLA with availability zones, and one governed hostname with no external router to operate.</w:t>
       </w:r>
     </w:p>
     <w:p>
@@ -215,7 +215,7 @@
         <w:spacing w:after="120" w:line="276"/>
       </w:pPr>
       <w:r>
-        <w:t xml:space="preserve">A single APIM instance, however, lives in one region: if that region fails, the endpoint fails with it. Making the entry point itself survive a regional outage requires a gateway presence in two regions. Because you also want traffic kept inside your Azure network — and a public global router such as Front Door or Traffic Manager cannot sit inside a VNet — this leads directly to </w:t>
+        <w:t xml:space="preserve">A single APIM instance, however, lives in one region: if that region fails, the endpoint fails with it. Making the entry point itself survive a regional outage requires a gateway presence in two regions behind one hostname. </w:t>
       </w:r>
       <w:r>
         <w:rPr>
@@ -225,7 +225,7 @@
         <w:t xml:space="preserve">APIM Premium multi-region</w:t>
       </w:r>
       <w:r>
-        <w:t xml:space="preserve">, the tier that provides both multi-region gateways and VNet integration.</w:t>
+        <w:t xml:space="preserve"> provides exactly that as a single managed service, which is why we recommend it over a public global router such as Front Door or Traffic Manager (an extra component to operate) or two separate gateways (two configurations to keep in sync).</w:t>
       </w:r>
     </w:p>
     <w:p>
@@ -406,10 +406,10 @@
           <w:b/>
           <w:bCs/>
         </w:rPr>
-        <w:t xml:space="preserve">Runs inside your VNet. </w:t>
-      </w:r>
-      <w:r>
-        <w:t xml:space="preserve">VNet integration keeps traffic on the Azure backbone and lets APIM sit in your network. Because the workload is entirely in Azure, service endpoints secure the backends with no extra cost or DNS changes; private endpoints remain available for per-resource isolation. Consumption cannot join a VNet, and a public edge/DNS router cannot sit inside one.</w:t>
+        <w:t xml:space="preserve">Single hostname, no external router. </w:t>
+      </w:r>
+      <w:r>
+        <w:t xml:space="preserve">One governed hostname across regions; Microsoft manages the cross-region routing, so there is no separate global router to run.</w:t>
       </w:r>
     </w:p>
     <w:p>
@@ -792,7 +792,7 @@
         <w:pStyle w:val="Heading1"/>
       </w:pPr>
       <w:r>
-        <w:t xml:space="preserve">Securing the traffic: service endpoints vs private endpoints</w:t>
+        <w:t xml:space="preserve">The trigger call and network hardening</w:t>
       </w:r>
     </w:p>
     <w:p>
@@ -809,10 +809,10 @@
           <w:b/>
           <w:bCs/>
         </w:rPr>
-        <w:t xml:space="preserve">Service endpoints (recommended here). </w:t>
-      </w:r>
-      <w:r>
-        <w:t xml:space="preserve">Keep each Azure service on its public IP but firewall it to your VNet/subnet; traffic stays on the Azure backbone. Free, no Private DNS to manage, VNet-scoped. Because this workload runs entirely in Azure, service endpoints are the simplest way to secure the ADF data plane and APIM's access to backends.</w:t>
+        <w:t xml:space="preserve">The trigger is a control-plane call. </w:t>
+      </w:r>
+      <w:r>
+        <w:t xml:space="preserve">createRun targets Azure Resource Manager (the ADF control plane), which is authorized by RBAC, not network path, so it keeps working regardless of how the data plane is secured.</w:t>
       </w:r>
     </w:p>
     <w:p>
@@ -829,30 +829,10 @@
           <w:b/>
           <w:bCs/>
         </w:rPr>
-        <w:t xml:space="preserve">Private endpoints (optional). </w:t>
-      </w:r>
-      <w:r>
-        <w:t xml:space="preserve">Inject a private IP into your subnet mapped to a specific resource, let you disable the public endpoint, and are reachable from on-premises. Choose these for per-resource isolation, stronger exfiltration control, or on-prem reach — at the cost of per-endpoint charges and Private DNS management.</w:t>
-      </w:r>
-    </w:p>
-    <w:p>
-      <w:pPr>
-        <w:pStyle w:val="ListParagraph"/>
-        <w:numPr>
-          <w:ilvl w:val="0"/>
-          <w:numId w:val="2"/>
-        </w:numPr>
-        <w:spacing w:after="60" w:line="276"/>
-      </w:pPr>
-      <w:r>
-        <w:rPr>
-          <w:b/>
-          <w:bCs/>
-        </w:rPr>
-        <w:t xml:space="preserve">The trigger call is unaffected either way. </w:t>
-      </w:r>
-      <w:r>
-        <w:t xml:space="preserve">createRun targets Azure Resource Manager (the ADF control plane), authorized by RBAC rather than network path, so it keeps working regardless of how the data plane is secured.</w:t>
+        <w:t xml:space="preserve">Data-plane hardening is separate. </w:t>
+      </w:r>
+      <w:r>
+        <w:t xml:space="preserve">The pipelines' connections to storage, SQL, and Key Vault are secured per region using your standard Azure networking approach.</w:t>
       </w:r>
     </w:p>
     <w:p>
@@ -1249,7 +1229,7 @@
           </w:tcPr>
           <w:p>
             <w:r>
-              <w:t xml:space="preserve">Single logical, config-replicated, VNet-capable service</w:t>
+              <w:t xml:space="preserve">Single logical, config-replicated, multi-region service</w:t>
             </w:r>
           </w:p>
         </w:tc>
@@ -1288,17 +1268,7 @@
         <w:spacing w:after="120" w:line="276"/>
       </w:pPr>
       <w:r>
-        <w:t xml:space="preserve">Premium is materially more than a Consumption-tier approach, but it is the tier that delivers regional-outage survival </w:t>
-      </w:r>
-      <w:r>
-        <w:rPr>
-          <w:b/>
-          <w:bCs/>
-        </w:rPr>
-        <w:t xml:space="preserve">and</w:t>
-      </w:r>
-      <w:r>
-        <w:t xml:space="preserve"> VNet integration together. Figures are planning estimates from the Azure Retail Prices API (list price, East US 2, July 2026); confirm against the Azure Pricing Calculator and your agreement before budgeting.</w:t>
+        <w:t xml:space="preserve">Premium is materially more than a Consumption-tier approach, but it is the tier that delivers regional-outage survival for the trigger endpoint. Figures are planning estimates from the Azure Retail Prices API (list price, East US 2, July 2026); confirm against the Azure Pricing Calculator and your agreement before budgeting.</w:t>
       </w:r>
     </w:p>
     <w:p>
@@ -1319,7 +1289,7 @@
         <w:spacing w:after="60" w:line="276"/>
       </w:pPr>
       <w:r>
-        <w:t xml:space="preserve">Confirm target regions and provision APIM Premium multi-region with VNet integration.</w:t>
+        <w:t xml:space="preserve">Confirm target regions and provision APIM Premium multi-region.</w:t>
       </w:r>
     </w:p>
     <w:p>
@@ -1345,7 +1315,7 @@
         <w:spacing w:after="60" w:line="276"/>
       </w:pPr>
       <w:r>
-        <w:t xml:space="preserve">Deploy pipelines identically to both factories, and secure the data-plane connectivity (service endpoints, or private endpoints where stricter isolation is needed) per region.</w:t>
+        <w:t xml:space="preserve">Deploy pipelines identically to both factories, and secure the data-plane connectivity per region using your standard Azure networking approach.</w:t>
       </w:r>
     </w:p>
     <w:p>

</xml_diff>